<commit_message>
docs: sync v1.6 task book and launcher fix
</commit_message>
<xml_diff>
--- a/docs/项目任务书-本地文档知识库桌面助手-V1.6.docx
+++ b/docs/项目任务书-本地文档知识库桌面助手-V1.6.docx
@@ -657,6 +657,68 @@
                 <w:rFonts w:ascii="宋体" w:hAnsi="宋体" w:eastAsia="宋体"/>
                 <w:sz w:val="18"/>
               </w:rPr>
+              <w:t>修订：完善 PDF 滚轮翻页与真实缩放、全局按钮动效、空索引保护和选中文本询问 AI</w:t>
+            </w:r>
+          </w:p>
+        </w:tc>
+      </w:tr>
+      <w:tr>
+        <w:tc>
+          <w:tcPr>
+            <w:tcW w:type="dxa" w:w="2394"/>
+          </w:tcPr>
+          <w:p>
+            <w:r/>
+            <w:r>
+              <w:rPr>
+                <w:rFonts w:ascii="宋体" w:hAnsi="宋体" w:eastAsia="宋体"/>
+                <w:sz w:val="18"/>
+              </w:rPr>
+              <w:t>V1.6</w:t>
+            </w:r>
+          </w:p>
+        </w:tc>
+        <w:tc>
+          <w:tcPr>
+            <w:tcW w:type="dxa" w:w="2394"/>
+          </w:tcPr>
+          <w:p>
+            <w:r/>
+            <w:r>
+              <w:rPr>
+                <w:rFonts w:ascii="宋体" w:hAnsi="宋体" w:eastAsia="宋体"/>
+                <w:sz w:val="18"/>
+              </w:rPr>
+              <w:t>2026-09-29</w:t>
+            </w:r>
+          </w:p>
+        </w:tc>
+        <w:tc>
+          <w:tcPr>
+            <w:tcW w:type="dxa" w:w="2394"/>
+          </w:tcPr>
+          <w:p>
+            <w:r/>
+            <w:r>
+              <w:rPr>
+                <w:rFonts w:ascii="宋体" w:hAnsi="宋体" w:eastAsia="宋体"/>
+                <w:sz w:val="18"/>
+              </w:rPr>
+              <w:t>项目组</w:t>
+            </w:r>
+          </w:p>
+        </w:tc>
+        <w:tc>
+          <w:tcPr>
+            <w:tcW w:type="dxa" w:w="2394"/>
+          </w:tcPr>
+          <w:p>
+            <w:r/>
+            <w:r>
+              <w:rPr>
+                <w:rFonts w:ascii="宋体" w:hAnsi="宋体" w:eastAsia="宋体"/>
+                <w:sz w:val="18"/>
+              </w:rPr>
               <w:t>修订：完善 PDF 滚轮翻页与真实缩放、平滑按钮动效、空索引对话保护和选文右键询问 AI</w:t>
             </w:r>
           </w:p>
@@ -10153,6 +10215,194 @@
                 <w:sz w:val="18"/>
               </w:rPr>
               <w:t>根据当前 AI 供应商展示 Flash/Pro 等模型档位，切换后自动更新具体模型名</w:t>
+            </w:r>
+          </w:p>
+        </w:tc>
+      </w:tr>
+      <w:tr>
+        <w:tc>
+          <w:tcPr>
+            <w:tcW w:type="dxa" w:w="3192"/>
+          </w:tcPr>
+          <w:p>
+            <w:r/>
+            <w:r>
+              <w:rPr>
+                <w:rFonts w:ascii="宋体" w:hAnsi="宋体" w:eastAsia="宋体"/>
+                <w:sz w:val="18"/>
+              </w:rPr>
+              <w:t>SYS-12</w:t>
+            </w:r>
+          </w:p>
+        </w:tc>
+        <w:tc>
+          <w:tcPr>
+            <w:tcW w:type="dxa" w:w="3192"/>
+          </w:tcPr>
+          <w:p>
+            <w:r/>
+            <w:r>
+              <w:rPr>
+                <w:rFonts w:ascii="宋体" w:hAnsi="宋体" w:eastAsia="宋体"/>
+                <w:sz w:val="18"/>
+              </w:rPr>
+              <w:t>PDF 交互</w:t>
+            </w:r>
+          </w:p>
+        </w:tc>
+        <w:tc>
+          <w:tcPr>
+            <w:tcW w:type="dxa" w:w="3192"/>
+          </w:tcPr>
+          <w:p>
+            <w:r/>
+            <w:r>
+              <w:rPr>
+                <w:rFonts w:ascii="宋体" w:hAnsi="宋体" w:eastAsia="宋体"/>
+                <w:sz w:val="18"/>
+              </w:rPr>
+              <w:t>鼠标滚轮切换 PDF 页，Ctrl+滚轮缩放，缩放倍率真实改变页面尺寸</w:t>
+            </w:r>
+          </w:p>
+        </w:tc>
+      </w:tr>
+      <w:tr>
+        <w:tc>
+          <w:tcPr>
+            <w:tcW w:type="dxa" w:w="3192"/>
+          </w:tcPr>
+          <w:p>
+            <w:r/>
+            <w:r>
+              <w:rPr>
+                <w:rFonts w:ascii="宋体" w:hAnsi="宋体" w:eastAsia="宋体"/>
+                <w:sz w:val="18"/>
+              </w:rPr>
+              <w:t>SYS-13</w:t>
+            </w:r>
+          </w:p>
+        </w:tc>
+        <w:tc>
+          <w:tcPr>
+            <w:tcW w:type="dxa" w:w="3192"/>
+          </w:tcPr>
+          <w:p>
+            <w:r/>
+            <w:r>
+              <w:rPr>
+                <w:rFonts w:ascii="宋体" w:hAnsi="宋体" w:eastAsia="宋体"/>
+                <w:sz w:val="18"/>
+              </w:rPr>
+              <w:t>平滑反馈</w:t>
+            </w:r>
+          </w:p>
+        </w:tc>
+        <w:tc>
+          <w:tcPr>
+            <w:tcW w:type="dxa" w:w="3192"/>
+          </w:tcPr>
+          <w:p>
+            <w:r/>
+            <w:r>
+              <w:rPr>
+                <w:rFonts w:ascii="宋体" w:hAnsi="宋体" w:eastAsia="宋体"/>
+                <w:sz w:val="18"/>
+              </w:rPr>
+              <w:t>按钮悬停、按下、释放时使用短时阴影过渡，保持布局稳定</w:t>
+            </w:r>
+          </w:p>
+        </w:tc>
+      </w:tr>
+      <w:tr>
+        <w:tc>
+          <w:tcPr>
+            <w:tcW w:type="dxa" w:w="3192"/>
+          </w:tcPr>
+          <w:p>
+            <w:r/>
+            <w:r>
+              <w:rPr>
+                <w:rFonts w:ascii="宋体" w:hAnsi="宋体" w:eastAsia="宋体"/>
+                <w:sz w:val="18"/>
+              </w:rPr>
+              <w:t>SYS-14</w:t>
+            </w:r>
+          </w:p>
+        </w:tc>
+        <w:tc>
+          <w:tcPr>
+            <w:tcW w:type="dxa" w:w="3192"/>
+          </w:tcPr>
+          <w:p>
+            <w:r/>
+            <w:r>
+              <w:rPr>
+                <w:rFonts w:ascii="宋体" w:hAnsi="宋体" w:eastAsia="宋体"/>
+                <w:sz w:val="18"/>
+              </w:rPr>
+              <w:t>空索引保护</w:t>
+            </w:r>
+          </w:p>
+        </w:tc>
+        <w:tc>
+          <w:tcPr>
+            <w:tcW w:type="dxa" w:w="3192"/>
+          </w:tcPr>
+          <w:p>
+            <w:r/>
+            <w:r>
+              <w:rPr>
+                <w:rFonts w:ascii="宋体" w:hAnsi="宋体" w:eastAsia="宋体"/>
+                <w:sz w:val="18"/>
+              </w:rPr>
+              <w:t>无已索引内容时不加载嵌入模型、不发送 AI 请求，并提示上传或处理文档</w:t>
+            </w:r>
+          </w:p>
+        </w:tc>
+      </w:tr>
+      <w:tr>
+        <w:tc>
+          <w:tcPr>
+            <w:tcW w:type="dxa" w:w="3192"/>
+          </w:tcPr>
+          <w:p>
+            <w:r/>
+            <w:r>
+              <w:rPr>
+                <w:rFonts w:ascii="宋体" w:hAnsi="宋体" w:eastAsia="宋体"/>
+                <w:sz w:val="18"/>
+              </w:rPr>
+              <w:t>SYS-15</w:t>
+            </w:r>
+          </w:p>
+        </w:tc>
+        <w:tc>
+          <w:tcPr>
+            <w:tcW w:type="dxa" w:w="3192"/>
+          </w:tcPr>
+          <w:p>
+            <w:r/>
+            <w:r>
+              <w:rPr>
+                <w:rFonts w:ascii="宋体" w:hAnsi="宋体" w:eastAsia="宋体"/>
+                <w:sz w:val="18"/>
+              </w:rPr>
+              <w:t>右键问 AI</w:t>
+            </w:r>
+          </w:p>
+        </w:tc>
+        <w:tc>
+          <w:tcPr>
+            <w:tcW w:type="dxa" w:w="3192"/>
+          </w:tcPr>
+          <w:p>
+            <w:r/>
+            <w:r>
+              <w:rPr>
+                <w:rFonts w:ascii="宋体" w:hAnsi="宋体" w:eastAsia="宋体"/>
+                <w:sz w:val="18"/>
+              </w:rPr>
+              <w:t>文本选中后右键可直接询问 AI；PDF 支持按当前页询问，内容进入 AI 侧栏</w:t>
             </w:r>
           </w:p>
         </w:tc>
@@ -16515,6 +16765,194 @@
                 <w:sz w:val="18"/>
               </w:rPr>
               <w:t>切换供应商后显示对应 Flash/Pro 档位；选择档位后具体模型名和右上角显示同步更新</w:t>
+            </w:r>
+          </w:p>
+        </w:tc>
+      </w:tr>
+      <w:tr>
+        <w:tc>
+          <w:tcPr>
+            <w:tcW w:type="dxa" w:w="3192"/>
+          </w:tcPr>
+          <w:p>
+            <w:r/>
+            <w:r>
+              <w:rPr>
+                <w:rFonts w:ascii="宋体" w:hAnsi="宋体" w:eastAsia="宋体"/>
+                <w:sz w:val="18"/>
+              </w:rPr>
+              <w:t>ACC-SYS11</w:t>
+            </w:r>
+          </w:p>
+        </w:tc>
+        <w:tc>
+          <w:tcPr>
+            <w:tcW w:type="dxa" w:w="3192"/>
+          </w:tcPr>
+          <w:p>
+            <w:r/>
+            <w:r>
+              <w:rPr>
+                <w:rFonts w:ascii="宋体" w:hAnsi="宋体" w:eastAsia="宋体"/>
+                <w:sz w:val="18"/>
+              </w:rPr>
+              <w:t>PDF 滚轮</w:t>
+            </w:r>
+          </w:p>
+        </w:tc>
+        <w:tc>
+          <w:tcPr>
+            <w:tcW w:type="dxa" w:w="3192"/>
+          </w:tcPr>
+          <w:p>
+            <w:r/>
+            <w:r>
+              <w:rPr>
+                <w:rFonts w:ascii="宋体" w:hAnsi="宋体" w:eastAsia="宋体"/>
+                <w:sz w:val="18"/>
+              </w:rPr>
+              <w:t>上下滚轮切换上一页/下一页；连续滚轮不会一次跳过多个页面</w:t>
+            </w:r>
+          </w:p>
+        </w:tc>
+      </w:tr>
+      <w:tr>
+        <w:tc>
+          <w:tcPr>
+            <w:tcW w:type="dxa" w:w="3192"/>
+          </w:tcPr>
+          <w:p>
+            <w:r/>
+            <w:r>
+              <w:rPr>
+                <w:rFonts w:ascii="宋体" w:hAnsi="宋体" w:eastAsia="宋体"/>
+                <w:sz w:val="18"/>
+              </w:rPr>
+              <w:t>ACC-SYS12</w:t>
+            </w:r>
+          </w:p>
+        </w:tc>
+        <w:tc>
+          <w:tcPr>
+            <w:tcW w:type="dxa" w:w="3192"/>
+          </w:tcPr>
+          <w:p>
+            <w:r/>
+            <w:r>
+              <w:rPr>
+                <w:rFonts w:ascii="宋体" w:hAnsi="宋体" w:eastAsia="宋体"/>
+                <w:sz w:val="18"/>
+              </w:rPr>
+              <w:t>PDF 缩放</w:t>
+            </w:r>
+          </w:p>
+        </w:tc>
+        <w:tc>
+          <w:tcPr>
+            <w:tcW w:type="dxa" w:w="3192"/>
+          </w:tcPr>
+          <w:p>
+            <w:r/>
+            <w:r>
+              <w:rPr>
+                <w:rFonts w:ascii="宋体" w:hAnsi="宋体" w:eastAsia="宋体"/>
+                <w:sz w:val="18"/>
+              </w:rPr>
+              <w:t>Ctrl+滚轮或缩放按钮改变页面渲染尺寸，倍率显示与实际尺寸一致</w:t>
+            </w:r>
+          </w:p>
+        </w:tc>
+      </w:tr>
+      <w:tr>
+        <w:tc>
+          <w:tcPr>
+            <w:tcW w:type="dxa" w:w="3192"/>
+          </w:tcPr>
+          <w:p>
+            <w:r/>
+            <w:r>
+              <w:rPr>
+                <w:rFonts w:ascii="宋体" w:hAnsi="宋体" w:eastAsia="宋体"/>
+                <w:sz w:val="18"/>
+              </w:rPr>
+              <w:t>ACC-SYS13</w:t>
+            </w:r>
+          </w:p>
+        </w:tc>
+        <w:tc>
+          <w:tcPr>
+            <w:tcW w:type="dxa" w:w="3192"/>
+          </w:tcPr>
+          <w:p>
+            <w:r/>
+            <w:r>
+              <w:rPr>
+                <w:rFonts w:ascii="宋体" w:hAnsi="宋体" w:eastAsia="宋体"/>
+                <w:sz w:val="18"/>
+              </w:rPr>
+              <w:t>空库不卡顿</w:t>
+            </w:r>
+          </w:p>
+        </w:tc>
+        <w:tc>
+          <w:tcPr>
+            <w:tcW w:type="dxa" w:w="3192"/>
+          </w:tcPr>
+          <w:p>
+            <w:r/>
+            <w:r>
+              <w:rPr>
+                <w:rFonts w:ascii="宋体" w:hAnsi="宋体" w:eastAsia="宋体"/>
+                <w:sz w:val="18"/>
+              </w:rPr>
+              <w:t>空知识库或尚未完成索引时禁用发送，不进入模型加载等待</w:t>
+            </w:r>
+          </w:p>
+        </w:tc>
+      </w:tr>
+      <w:tr>
+        <w:tc>
+          <w:tcPr>
+            <w:tcW w:type="dxa" w:w="3192"/>
+          </w:tcPr>
+          <w:p>
+            <w:r/>
+            <w:r>
+              <w:rPr>
+                <w:rFonts w:ascii="宋体" w:hAnsi="宋体" w:eastAsia="宋体"/>
+                <w:sz w:val="18"/>
+              </w:rPr>
+              <w:t>ACC-SYS14</w:t>
+            </w:r>
+          </w:p>
+        </w:tc>
+        <w:tc>
+          <w:tcPr>
+            <w:tcW w:type="dxa" w:w="3192"/>
+          </w:tcPr>
+          <w:p>
+            <w:r/>
+            <w:r>
+              <w:rPr>
+                <w:rFonts w:ascii="宋体" w:hAnsi="宋体" w:eastAsia="宋体"/>
+                <w:sz w:val="18"/>
+              </w:rPr>
+              <w:t>选中问 AI</w:t>
+            </w:r>
+          </w:p>
+        </w:tc>
+        <w:tc>
+          <w:tcPr>
+            <w:tcW w:type="dxa" w:w="3192"/>
+          </w:tcPr>
+          <w:p>
+            <w:r/>
+            <w:r>
+              <w:rPr>
+                <w:rFonts w:ascii="宋体" w:hAnsi="宋体" w:eastAsia="宋体"/>
+                <w:sz w:val="18"/>
+              </w:rPr>
+              <w:t>文本选中后右键询问 AI，侧栏展开并带入选中内容</w:t>
             </w:r>
           </w:p>
         </w:tc>

</xml_diff>